<commit_message>
Book 1 companion pages + toolkit synced to 2E v2 final text
Companion pages match the #270/#271 manuscript fixes (Two-Step method, C.5 numbering, glossary chapter refs, no dashes or pivots). Kit rebuilt from the final 2E.

Co-Authored-By: Claude Opus 5.5 <noreply@anthropic.com>
</commit_message>
<xml_diff>
--- a/dl/taa-toolkit/01_Exercises_Editable.docx
+++ b/dl/taa-toolkit/01_Exercises_Editable.docx
@@ -76,7 +76,7 @@
           <w:rFonts w:ascii="Calibri" w:hAnsi="Calibri"/>
           <w:color w:val="1C2430"/>
         </w:rPr>
-        <w:t>Treat every AI response as a starting point you check before you rely on it. The fastest way to build that reflex is to go looking for a wrong answer on purpose. Fair warning: you may well find the number below is off or out of date. That is exactly the point of the exercise.</w:t>
+        <w:t>Treat every AI response as a starting point you check before you rely on it. The fastest way to build that reflex is to go looking for a wrong answer on purpose. Fair warning: you may well find the number you get back is off or out of date. That is exactly the point of the exercise.</w:t>
       </w:r>
     </w:p>
     <w:p>
@@ -85,7 +85,7 @@
           <w:rFonts w:ascii="Calibri" w:hAnsi="Calibri"/>
           <w:color w:val="1C2430"/>
         </w:rPr>
-        <w:t>Part 1: Ask a factual question. Open a chat and ask something specific and checkable, like a statistic or a named figure with a correct answer you could look up. Try "What is the current GDP of Norway?" or "What is the population of Tokyo?" or any fact relevant to your work. A live, changing number like this is precisely the kind of thing a prediction engine tends to get stale or invent. Read the response in full before doing anything else.</w:t>
+        <w:t>Part 1: Ask a factual question. Open a chat and ask something specific and checkable, like a statistic or a named figure with a correct answer you could look up. Try "What is the current GDP of Norway?" or "What is the population of Tokyo?" or any fact relevant to your work. A live, changing number like this is precisely the kind of thing a prediction engine, trained on text up to a fixed date, tends to get stale or invent. Read the response in full before doing anything else.</w:t>
       </w:r>
     </w:p>
     <w:p>
@@ -112,7 +112,7 @@
           <w:rFonts w:ascii="Calibri" w:hAnsi="Calibri"/>
           <w:color w:val="1C2430"/>
         </w:rPr>
-        <w:t>From here on, apply that two-step pattern to anything you plan to act on: ask, then verify. The model is a capable research partner. You are the one responsible for what you do with the output.</w:t>
+        <w:t>From here on, apply that habit to anything you plan to act on: ask, then verify. The model is a capable research partner. You are the one responsible for what you do with the output.</w:t>
       </w:r>
     </w:p>
     <w:p>
@@ -251,7 +251,7 @@
           <w:rFonts w:ascii="Calibri" w:hAnsi="Calibri"/>
           <w:color w:val="1C2430"/>
         </w:rPr>
-        <w:t>Step 3: Send it, then verify. Send your prompt and read the full response before doing anything else. Then send your planned follow-up. Now write two sentences: which parts of the result came from your judgment (the task, the standard, the call on whether it's right), and which came from the AI's speed and reach (the options, the draft, the angles you wouldn't have produced alone). That line is the partnership. Keep both outputs side by side. You'll revisit them later in the book, when we map where the partnership reaches its limits.</w:t>
+        <w:t>Step 3: Send it, then verify. Send your prompt and read the full response before doing anything else. Then send your planned follow-up. Now write two sentences: which parts of the result came from your judgment (the task, the standard, the call on whether it's right), and which came from the AI's speed and reach (the options, the draft, the angles you wouldn't have produced alone). That line is the partnership. Keep both outputs side by side, and read them again once the next chapter maps where the partnership reaches its limits.</w:t>
       </w:r>
     </w:p>
     <w:p>
@@ -1450,7 +1450,7 @@
           <w:rFonts w:ascii="Calibri" w:hAnsi="Calibri"/>
           <w:color w:val="1C2430"/>
         </w:rPr>
-        <w:t>Photograph the whiteboard from a meeting whose decisions you actually need to keep, or a page of handwritten notes you'd otherwise have to retype. Upload the photo to your AI tool and use this prompt: "Please transcribe everything in this image and organize the content into a clean, structured format. Use headings where appropriate and preserve the original meaning."</w:t>
+        <w:t>Photograph the whiteboard from a meeting whose decisions you actually need to keep, a page of handwritten notes you'd otherwise have to retype, or a screenshot of a dashboard you need to explain. Upload the photo to your AI tool and use this prompt: "Please transcribe everything in this image and organize the content into a clean, structured format. Use headings where appropriate and preserve the original meaning."</w:t>
       </w:r>
     </w:p>
     <w:p>
@@ -1595,7 +1595,7 @@
           <w:rFonts w:ascii="Calibri" w:hAnsi="Calibri"/>
           <w:color w:val="1C2430"/>
         </w:rPr>
-        <w:t>Access note: you can run this one on a free tier, within limits. ChatGPT's free plan includes a small daily allowance of image generations, and Adobe Firefly and Canva AI both hand you free credits to work with. A paid plan raises the ceiling if you find yourself doing this often, and it is not required to finish the exercise. Claude does not currently generate images, so reach for one of the others here. Those details were true as this book went to press, and they shift release to release, so check your tool's current limits before paying for anything. Appendix B has the full comparison.</w:t>
+        <w:t>Access note: you can run this one on a free tier, within limits. ChatGPT and Gemini both include a limited allowance of image generations on their free plans, and Adobe Firefly and Canva both give free users a small allowance of their own. A paid plan raises the ceiling if you find yourself doing this often, and it is not required to finish the exercise. Claude does not currently generate images, so reach for one of the others here. Those details were true as this book went to press, and they shift release to release, so check your tool's current limits before paying for anything. Appendix B has the full comparison.</w:t>
       </w:r>
     </w:p>
     <w:p>
@@ -1812,7 +1812,7 @@
           <w:rFonts w:ascii="Calibri" w:hAnsi="Calibri"/>
           <w:color w:val="1C2430"/>
         </w:rPr>
-        <w:t>From here, let it develop. Answer its questions, push back when something doesn't fit, and ask it to stress-test your assumptions. Go at least five exchanges deep, then paste this:</w:t>
+        <w:t>From here, let it develop. Answer its questions, push back when something doesn't fit, and ask it to stress-test your assumptions, the poke-holes move from Chapter 4. Go at least five exchanges deep, then paste this:</w:t>
       </w:r>
     </w:p>
     <w:p>
@@ -2153,7 +2153,7 @@
           <w:rFonts w:ascii="Calibri" w:hAnsi="Calibri"/>
           <w:color w:val="1C2430"/>
         </w:rPr>
-        <w:t>Real outputs often trip more than one rung, and this one trips two. The tone is far too formal for an internal team note, and it's also generic, signed "Management," addressed to no one in particular. When two symptoms fire at once, fix the one blocking use the most. Here that's tone: the email is unusable as written because of how it sounds, and tightening the tone also pulls it toward something specific to your team.</w:t>
+        <w:t>Real outputs often show more than one symptom, and this one shows two. The tone is far too formal for an internal team note, and it's also generic, signed "Management," addressed to no one in particular. When two symptoms fire at once, fix the one blocking use the most. Here that's tone: the email is unusable as written because of how it sounds, and tightening the tone also pulls it toward something specific to your team.</w:t>
       </w:r>
     </w:p>
     <w:p>
@@ -2373,7 +2373,7 @@
           <w:rFonts w:ascii="Calibri" w:hAnsi="Calibri"/>
           <w:color w:val="1C2430"/>
         </w:rPr>
-        <w:t>Template thinking. If this is a task you do at least monthly, save the prompt that worked into your My Prompts doc. That saved prompt is the start of your library.</w:t>
+        <w:t>Template thinking. If this is a task you do at least monthly, save the prompt that worked into your My Prompts doc. Your My Prompts doc is the prompt library you started in Chapter 5, now one entry richer.</w:t>
       </w:r>
     </w:p>
     <w:p>

</xml_diff>